<commit_message>
Adjust case to disallow all uses of the sigsterren font
</commit_message>
<xml_diff>
--- a/src/report_generator/presets/templates/debug-template.docx
+++ b/src/report_generator/presets/templates/debug-template.docx
@@ -286,7 +286,6 @@
           <w:tcPr>
             <w:tcW w:w="9072" w:type="dxa"/>
             <w:gridSpan w:val="3"/>
-            <w:shd w:val="clear" w:color="auto" w:fill="auto"/>
           </w:tcPr>
           <w:p>
             <w:pPr>
@@ -308,7 +307,6 @@
         <w:tc>
           <w:tcPr>
             <w:tcW w:w="3024" w:type="dxa"/>
-            <w:shd w:val="clear" w:color="auto" w:fill="auto"/>
           </w:tcPr>
           <w:bookmarkStart w:id="1" w:name="Date" w:displacedByCustomXml="next"/>
           <w:bookmarkEnd w:id="1" w:displacedByCustomXml="next"/>
@@ -414,7 +412,6 @@
         <w:tc>
           <w:tcPr>
             <w:tcW w:w="3024" w:type="dxa"/>
-            <w:shd w:val="clear" w:color="auto" w:fill="auto"/>
           </w:tcPr>
           <w:sdt>
             <w:sdtPr>
@@ -518,7 +515,6 @@
         <w:tc>
           <w:tcPr>
             <w:tcW w:w="3024" w:type="dxa"/>
-            <w:shd w:val="clear" w:color="auto" w:fill="auto"/>
           </w:tcPr>
           <w:sdt>
             <w:sdtPr>
@@ -628,7 +624,6 @@
           <w:tcPr>
             <w:tcW w:w="9072" w:type="dxa"/>
             <w:gridSpan w:val="3"/>
-            <w:shd w:val="clear" w:color="auto" w:fill="auto"/>
           </w:tcPr>
           <w:p>
             <w:pPr>
@@ -771,6 +766,7 @@
       <w:bookmarkStart w:id="3" w:name="_Toc291499782"/>
       <w:bookmarkStart w:id="4" w:name="_Toc440539946"/>
       <w:r>
+        <w:lastRenderedPageBreak/>
         <w:br w:type="page"/>
       </w:r>
     </w:p>
@@ -782,6 +778,7 @@
       <w:bookmarkEnd w:id="3"/>
       <w:bookmarkEnd w:id="4"/>
       <w:r>
+        <w:lastRenderedPageBreak/>
         <w:t>Table of contents</w:t>
       </w:r>
       <w:bookmarkEnd w:id="5"/>
@@ -963,6 +960,7 @@
       </w:pPr>
       <w:bookmarkStart w:id="6" w:name="_Toc27652542"/>
       <w:r>
+        <w:lastRenderedPageBreak/>
         <w:t>Introducti</w:t>
       </w:r>
       <w:r>
@@ -984,6 +982,7 @@
         <w:pStyle w:val="Heading1"/>
       </w:pPr>
       <w:r>
+        <w:lastRenderedPageBreak/>
         <w:t>Maintainability</w:t>
       </w:r>
     </w:p>
@@ -993,7 +992,7 @@
       </w:r>
       <w:r>
         <w:rPr>
-          <w:rFonts w:ascii="Sigsterren" w:hAnsi="Sigsterren"/>
+          <w:rFonts w:cstheme="minorHAnsi"/>
         </w:rPr>
         <w:t>MAINT_STARS</w:t>
       </w:r>
@@ -1022,8 +1021,8 @@
         <w:tblLook w:val="04A0" w:firstRow="1" w:lastRow="0" w:firstColumn="1" w:lastColumn="0" w:noHBand="0" w:noVBand="1"/>
       </w:tblPr>
       <w:tblGrid>
-        <w:gridCol w:w="1648"/>
-        <w:gridCol w:w="3558"/>
+        <w:gridCol w:w="1859"/>
+        <w:gridCol w:w="3347"/>
         <w:gridCol w:w="4132"/>
       </w:tblGrid>
       <w:tr>
@@ -1067,12 +1066,12 @@
           <w:p>
             <w:pPr>
               <w:rPr>
-                <w:rFonts w:ascii="Sigsterren" w:hAnsi="Sigsterren"/>
+                <w:rFonts w:cstheme="minorHAnsi"/>
               </w:rPr>
             </w:pPr>
             <w:r>
               <w:rPr>
-                <w:rFonts w:ascii="Sigsterren" w:hAnsi="Sigsterren"/>
+                <w:rFonts w:cstheme="minorHAnsi"/>
               </w:rPr>
               <w:t>STARS_VOLUME</w:t>
             </w:r>
@@ -1111,9 +1110,14 @@
             <w:tcW w:w="3113" w:type="dxa"/>
           </w:tcPr>
           <w:p>
+            <w:pPr>
+              <w:rPr>
+                <w:rFonts w:cstheme="minorHAnsi"/>
+              </w:rPr>
+            </w:pPr>
             <w:r>
               <w:rPr>
-                <w:rFonts w:ascii="Sigsterren" w:eastAsia="MS PGothic" w:hAnsi="Sigsterren" w:cs="TheSans B7 Bold"/>
+                <w:rFonts w:eastAsia="MS PGothic" w:cstheme="minorHAnsi"/>
                 <w:color w:val="17313F" w:themeColor="text2"/>
                 <w:kern w:val="24"/>
               </w:rPr>
@@ -1160,9 +1164,14 @@
             <w:tcW w:w="3113" w:type="dxa"/>
           </w:tcPr>
           <w:p>
+            <w:pPr>
+              <w:rPr>
+                <w:rFonts w:cstheme="minorHAnsi"/>
+              </w:rPr>
+            </w:pPr>
             <w:r>
               <w:rPr>
-                <w:rFonts w:ascii="Sigsterren" w:eastAsia="MS PGothic" w:hAnsi="Sigsterren" w:cs="TheSans B7 Bold"/>
+                <w:rFonts w:eastAsia="MS PGothic" w:cstheme="minorHAnsi"/>
                 <w:color w:val="17313F" w:themeColor="text2"/>
                 <w:kern w:val="24"/>
               </w:rPr>
@@ -1209,9 +1218,14 @@
             <w:tcW w:w="3113" w:type="dxa"/>
           </w:tcPr>
           <w:p>
+            <w:pPr>
+              <w:rPr>
+                <w:rFonts w:cstheme="minorHAnsi"/>
+              </w:rPr>
+            </w:pPr>
             <w:r>
               <w:rPr>
-                <w:rFonts w:ascii="Sigsterren" w:eastAsia="MS PGothic" w:hAnsi="Sigsterren" w:cs="TheSans B7 Bold"/>
+                <w:rFonts w:eastAsia="MS PGothic" w:cstheme="minorHAnsi"/>
                 <w:color w:val="17313F" w:themeColor="text2"/>
                 <w:kern w:val="24"/>
               </w:rPr>
@@ -1258,9 +1272,14 @@
             <w:tcW w:w="3113" w:type="dxa"/>
           </w:tcPr>
           <w:p>
+            <w:pPr>
+              <w:rPr>
+                <w:rFonts w:cstheme="minorHAnsi"/>
+              </w:rPr>
+            </w:pPr>
             <w:r>
               <w:rPr>
-                <w:rFonts w:ascii="Sigsterren" w:eastAsia="MS PGothic" w:hAnsi="Sigsterren" w:cs="TheSans B7 Bold"/>
+                <w:rFonts w:eastAsia="MS PGothic" w:cstheme="minorHAnsi"/>
                 <w:color w:val="17313F" w:themeColor="text2"/>
                 <w:kern w:val="24"/>
               </w:rPr>
@@ -1307,9 +1326,14 @@
             <w:tcW w:w="3113" w:type="dxa"/>
           </w:tcPr>
           <w:p>
+            <w:pPr>
+              <w:rPr>
+                <w:rFonts w:cstheme="minorHAnsi"/>
+              </w:rPr>
+            </w:pPr>
             <w:r>
               <w:rPr>
-                <w:rFonts w:ascii="Sigsterren" w:eastAsia="MS PGothic" w:hAnsi="Sigsterren" w:cs="TheSans B7 Bold"/>
+                <w:rFonts w:eastAsia="MS PGothic" w:cstheme="minorHAnsi"/>
                 <w:color w:val="17313F" w:themeColor="text2"/>
                 <w:kern w:val="24"/>
               </w:rPr>
@@ -1356,9 +1380,14 @@
             <w:tcW w:w="3113" w:type="dxa"/>
           </w:tcPr>
           <w:p>
+            <w:pPr>
+              <w:rPr>
+                <w:rFonts w:cstheme="minorHAnsi"/>
+              </w:rPr>
+            </w:pPr>
             <w:r>
               <w:rPr>
-                <w:rFonts w:ascii="Sigsterren" w:eastAsia="MS PGothic" w:hAnsi="Sigsterren" w:cs="TheSans B7 Bold"/>
+                <w:rFonts w:eastAsia="MS PGothic" w:cstheme="minorHAnsi"/>
                 <w:color w:val="17313F" w:themeColor="text2"/>
                 <w:kern w:val="24"/>
               </w:rPr>
@@ -1405,9 +1434,14 @@
             <w:tcW w:w="3113" w:type="dxa"/>
           </w:tcPr>
           <w:p>
+            <w:pPr>
+              <w:rPr>
+                <w:rFonts w:cstheme="minorHAnsi"/>
+              </w:rPr>
+            </w:pPr>
             <w:r>
               <w:rPr>
-                <w:rFonts w:ascii="Sigsterren" w:eastAsia="MS PGothic" w:hAnsi="Sigsterren" w:cs="TheSans B7 Bold"/>
+                <w:rFonts w:eastAsia="MS PGothic" w:cstheme="minorHAnsi"/>
                 <w:color w:val="17313F" w:themeColor="text2"/>
                 <w:kern w:val="24"/>
               </w:rPr>
@@ -1453,6 +1487,7 @@
         <w:pStyle w:val="Heading1"/>
       </w:pPr>
       <w:r>
+        <w:lastRenderedPageBreak/>
         <w:t>Architecture quality</w:t>
       </w:r>
     </w:p>
@@ -1462,13 +1497,13 @@
       </w:r>
       <w:r>
         <w:rPr>
-          <w:rFonts w:ascii="Sigsterren" w:hAnsi="Sigsterren"/>
+          <w:rFonts w:cstheme="minorHAnsi"/>
         </w:rPr>
         <w:t>ARCH_STARS</w:t>
       </w:r>
       <w:r>
         <w:rPr>
-          <w:rFonts w:ascii="Sigsterren" w:hAnsi="Sigsterren"/>
+          <w:rFonts w:cstheme="minorHAnsi"/>
         </w:rPr>
         <w:t xml:space="preserve"> </w:t>
       </w:r>
@@ -1559,12 +1594,12 @@
           <w:p>
             <w:pPr>
               <w:rPr>
-                <w:rFonts w:ascii="Sigsterren" w:hAnsi="Sigsterren"/>
+                <w:rFonts w:cstheme="minorHAnsi"/>
               </w:rPr>
             </w:pPr>
             <w:r>
               <w:rPr>
-                <w:rFonts w:ascii="Sigsterren" w:eastAsia="MS PGothic" w:hAnsi="Sigsterren" w:cs="TheSans B7 Bold"/>
+                <w:rFonts w:eastAsia="MS PGothic" w:cstheme="minorHAnsi"/>
                 <w:color w:val="17313F" w:themeColor="accent1"/>
                 <w:kern w:val="24"/>
               </w:rPr>
@@ -1611,9 +1646,14 @@
             <w:tcW w:w="2620" w:type="dxa"/>
           </w:tcPr>
           <w:p>
+            <w:pPr>
+              <w:rPr>
+                <w:rFonts w:cstheme="minorHAnsi"/>
+              </w:rPr>
+            </w:pPr>
             <w:r>
               <w:rPr>
-                <w:rFonts w:ascii="Sigsterren" w:eastAsia="MS PGothic" w:hAnsi="Sigsterren" w:cs="TheSans B7 Bold"/>
+                <w:rFonts w:eastAsia="MS PGothic" w:cstheme="minorHAnsi"/>
                 <w:color w:val="17313F" w:themeColor="accent1"/>
                 <w:kern w:val="24"/>
               </w:rPr>
@@ -1660,9 +1700,14 @@
             <w:tcW w:w="2620" w:type="dxa"/>
           </w:tcPr>
           <w:p>
+            <w:pPr>
+              <w:rPr>
+                <w:rFonts w:cstheme="minorHAnsi"/>
+              </w:rPr>
+            </w:pPr>
             <w:r>
               <w:rPr>
-                <w:rFonts w:ascii="Sigsterren" w:eastAsia="MS PGothic" w:hAnsi="Sigsterren" w:cs="TheSans B7 Bold"/>
+                <w:rFonts w:eastAsia="MS PGothic" w:cstheme="minorHAnsi"/>
                 <w:color w:val="17313F" w:themeColor="accent1"/>
                 <w:kern w:val="24"/>
               </w:rPr>
@@ -1700,55 +1745,6 @@
                 <w:color w:val="17313F" w:themeColor="text2"/>
                 <w:kern w:val="24"/>
               </w:rPr>
-              <w:t>Code Reuse</w:t>
-            </w:r>
-          </w:p>
-        </w:tc>
-        <w:tc>
-          <w:tcPr>
-            <w:tcW w:w="2620" w:type="dxa"/>
-          </w:tcPr>
-          <w:p>
-            <w:r>
-              <w:rPr>
-                <w:rFonts w:ascii="Sigsterren" w:eastAsia="MS PGothic" w:hAnsi="Sigsterren" w:cs="TheSans B7 Bold"/>
-                <w:color w:val="17313F" w:themeColor="accent1"/>
-                <w:kern w:val="24"/>
-              </w:rPr>
-              <w:t>STARS_CODE_REUSE</w:t>
-            </w:r>
-          </w:p>
-        </w:tc>
-        <w:tc>
-          <w:tcPr>
-            <w:tcW w:w="4029" w:type="dxa"/>
-            <w:vAlign w:val="center"/>
-          </w:tcPr>
-          <w:p>
-            <w:r>
-              <w:rPr>
-                <w:rFonts w:eastAsia="MS PGothic" w:hAnsi="Calibri" w:cs="TheSans B7 Bold"/>
-                <w:color w:val="17313F" w:themeColor="text2"/>
-                <w:kern w:val="24"/>
-              </w:rPr>
-              <w:t>ARCH_RATING_CODE_REUSE</w:t>
-            </w:r>
-          </w:p>
-        </w:tc>
-      </w:tr>
-      <w:tr>
-        <w:tc>
-          <w:tcPr>
-            <w:tcW w:w="2689" w:type="dxa"/>
-            <w:vAlign w:val="center"/>
-          </w:tcPr>
-          <w:p>
-            <w:r>
-              <w:rPr>
-                <w:rFonts w:eastAsia="MS PGothic" w:hAnsi="Calibri" w:cs="TheSans B7 Bold"/>
-                <w:color w:val="17313F" w:themeColor="text2"/>
-                <w:kern w:val="24"/>
-              </w:rPr>
               <w:t>Communication Centralization</w:t>
             </w:r>
           </w:p>
@@ -1758,9 +1754,14 @@
             <w:tcW w:w="2620" w:type="dxa"/>
           </w:tcPr>
           <w:p>
+            <w:pPr>
+              <w:rPr>
+                <w:rFonts w:cstheme="minorHAnsi"/>
+              </w:rPr>
+            </w:pPr>
             <w:r>
               <w:rPr>
-                <w:rFonts w:ascii="Sigsterren" w:eastAsia="MS PGothic" w:hAnsi="Sigsterren" w:cs="TheSans B7 Bold"/>
+                <w:rFonts w:eastAsia="MS PGothic" w:cstheme="minorHAnsi"/>
                 <w:color w:val="17313F" w:themeColor="accent1"/>
                 <w:kern w:val="24"/>
               </w:rPr>
@@ -1807,9 +1808,14 @@
             <w:tcW w:w="2620" w:type="dxa"/>
           </w:tcPr>
           <w:p>
+            <w:pPr>
+              <w:rPr>
+                <w:rFonts w:cstheme="minorHAnsi"/>
+              </w:rPr>
+            </w:pPr>
             <w:r>
               <w:rPr>
-                <w:rFonts w:ascii="Sigsterren" w:eastAsia="MS PGothic" w:hAnsi="Sigsterren" w:cs="TheSans B7 Bold"/>
+                <w:rFonts w:eastAsia="MS PGothic" w:cstheme="minorHAnsi"/>
                 <w:color w:val="17313F" w:themeColor="accent1"/>
                 <w:kern w:val="24"/>
               </w:rPr>
@@ -1847,55 +1853,6 @@
                 <w:color w:val="17313F" w:themeColor="text2"/>
                 <w:kern w:val="24"/>
               </w:rPr>
-              <w:t>Technology Prevalence</w:t>
-            </w:r>
-          </w:p>
-        </w:tc>
-        <w:tc>
-          <w:tcPr>
-            <w:tcW w:w="2620" w:type="dxa"/>
-          </w:tcPr>
-          <w:p>
-            <w:r>
-              <w:rPr>
-                <w:rFonts w:ascii="Sigsterren" w:eastAsia="MS PGothic" w:hAnsi="Sigsterren" w:cs="TheSans B7 Bold"/>
-                <w:color w:val="17313F" w:themeColor="accent1"/>
-                <w:kern w:val="24"/>
-              </w:rPr>
-              <w:t>STARS_TECHNOLOGY_PREVALENCE</w:t>
-            </w:r>
-          </w:p>
-        </w:tc>
-        <w:tc>
-          <w:tcPr>
-            <w:tcW w:w="4029" w:type="dxa"/>
-            <w:vAlign w:val="center"/>
-          </w:tcPr>
-          <w:p>
-            <w:r>
-              <w:rPr>
-                <w:rFonts w:eastAsia="MS PGothic" w:hAnsi="Calibri" w:cs="TheSans B7 Bold"/>
-                <w:color w:val="17313F" w:themeColor="text2"/>
-                <w:kern w:val="24"/>
-              </w:rPr>
-              <w:t>ARCH_RATING_TECHNOLOGY_PREVALENCE</w:t>
-            </w:r>
-          </w:p>
-        </w:tc>
-      </w:tr>
-      <w:tr>
-        <w:tc>
-          <w:tcPr>
-            <w:tcW w:w="2689" w:type="dxa"/>
-            <w:vAlign w:val="center"/>
-          </w:tcPr>
-          <w:p>
-            <w:r>
-              <w:rPr>
-                <w:rFonts w:eastAsia="MS PGothic" w:hAnsi="Calibri" w:cs="TheSans B7 Bold"/>
-                <w:color w:val="17313F" w:themeColor="text2"/>
-                <w:kern w:val="24"/>
-              </w:rPr>
               <w:t>Bounded evolution</w:t>
             </w:r>
           </w:p>
@@ -1905,9 +1862,14 @@
             <w:tcW w:w="2620" w:type="dxa"/>
           </w:tcPr>
           <w:p>
+            <w:pPr>
+              <w:rPr>
+                <w:rFonts w:cstheme="minorHAnsi"/>
+              </w:rPr>
+            </w:pPr>
             <w:r>
               <w:rPr>
-                <w:rFonts w:ascii="Sigsterren" w:eastAsia="MS PGothic" w:hAnsi="Sigsterren" w:cs="TheSans B7 Bold"/>
+                <w:rFonts w:eastAsia="MS PGothic" w:cstheme="minorHAnsi"/>
                 <w:color w:val="17313F" w:themeColor="accent1"/>
                 <w:kern w:val="24"/>
               </w:rPr>
@@ -1964,14 +1926,14 @@
           <w:p>
             <w:pPr>
               <w:rPr>
-                <w:rFonts w:ascii="Sigsterren" w:eastAsia="MS PGothic" w:hAnsi="Sigsterren" w:cs="TheSans B7 Bold"/>
+                <w:rFonts w:eastAsia="MS PGothic" w:cstheme="minorHAnsi"/>
                 <w:color w:val="17313F" w:themeColor="accent1"/>
                 <w:kern w:val="24"/>
               </w:rPr>
             </w:pPr>
             <w:r>
               <w:rPr>
-                <w:rFonts w:ascii="Sigsterren" w:eastAsia="MS PGothic" w:hAnsi="Sigsterren" w:cs="TheSans B7 Bold"/>
+                <w:rFonts w:eastAsia="MS PGothic" w:cstheme="minorHAnsi"/>
                 <w:color w:val="17313F" w:themeColor="accent1"/>
                 <w:kern w:val="24"/>
               </w:rPr>
@@ -2034,14 +1996,14 @@
           <w:p>
             <w:pPr>
               <w:rPr>
-                <w:rFonts w:ascii="Sigsterren" w:eastAsia="MS PGothic" w:hAnsi="Sigsterren" w:cs="TheSans B7 Bold"/>
+                <w:rFonts w:eastAsia="MS PGothic" w:cstheme="minorHAnsi"/>
                 <w:color w:val="17313F" w:themeColor="accent1"/>
                 <w:kern w:val="24"/>
               </w:rPr>
             </w:pPr>
             <w:r>
               <w:rPr>
-                <w:rFonts w:ascii="Sigsterren" w:eastAsia="MS PGothic" w:hAnsi="Sigsterren" w:cs="TheSans B7 Bold"/>
+                <w:rFonts w:eastAsia="MS PGothic" w:cstheme="minorHAnsi"/>
                 <w:color w:val="17313F" w:themeColor="accent1"/>
                 <w:kern w:val="24"/>
               </w:rPr>
@@ -2391,6 +2353,7 @@
       <w:bookmarkStart w:id="10" w:name="A_Appendix"/>
       <w:bookmarkStart w:id="11" w:name="_Toc27652543"/>
       <w:r>
+        <w:lastRenderedPageBreak/>
         <w:t xml:space="preserve">First </w:t>
       </w:r>
       <w:r>
@@ -2410,6 +2373,7 @@
         <w:pStyle w:val="Contact"/>
       </w:pPr>
       <w:r>
+        <w:lastRenderedPageBreak/>
         <w:drawing>
           <wp:anchor distT="0" distB="0" distL="114300" distR="114300" simplePos="0" relativeHeight="251658240" behindDoc="1" locked="1" layoutInCell="1" allowOverlap="1" wp14:anchorId="264EC7B7" wp14:editId="375071DA">
             <wp:simplePos x="0" y="0"/>
@@ -6340,13 +6304,6 @@
     <w:pitch w:val="fixed"/>
     <w:sig w:usb0="E00002FF" w:usb1="6AC7FDFB" w:usb2="08000012" w:usb3="00000000" w:csb0="0002009F" w:csb1="00000000"/>
   </w:font>
-  <w:font w:name="Sigsterren">
-    <w:panose1 w:val="05000500000000020004"/>
-    <w:charset w:val="00"/>
-    <w:family w:val="decorative"/>
-    <w:pitch w:val="variable"/>
-    <w:sig w:usb0="00000003" w:usb1="00000000" w:usb2="00000000" w:usb3="00000000" w:csb0="00000001" w:csb1="00000000"/>
-  </w:font>
   <w:font w:name="MS PGothic">
     <w:altName w:val="ＭＳ Ｐゴシック"/>
     <w:panose1 w:val="020B0600070205080204"/>
@@ -6365,9 +6322,9 @@
   <w:font w:name="Aptos">
     <w:panose1 w:val="020B0004020202020204"/>
     <w:charset w:val="00"/>
-    <w:family w:val="roman"/>
-    <w:notTrueType/>
-    <w:pitch w:val="default"/>
+    <w:family w:val="swiss"/>
+    <w:pitch w:val="variable"/>
+    <w:sig w:usb0="20000287" w:usb1="00000003" w:usb2="00000000" w:usb3="00000000" w:csb0="0000019F" w:csb1="00000000"/>
   </w:font>
   <w:font w:name="Aptos Display">
     <w:panose1 w:val="020B0004020202020204"/>
@@ -6395,10 +6352,12 @@
   </w:compat>
   <w:rsids>
     <w:rsidRoot w:val="00AB402C"/>
+    <w:rsid w:val="000478AA"/>
     <w:rsid w:val="00237558"/>
     <w:rsid w:val="00637D3F"/>
     <w:rsid w:val="007D58E6"/>
     <w:rsid w:val="00AB402C"/>
+    <w:rsid w:val="00AF089F"/>
   </w:rsids>
   <m:mathPr>
     <m:mathFont m:val="Cambria Math"/>

</xml_diff>